<commit_message>
Made changes in cover page of avon_river_report_v2.docx and updated Lecturer title in it and README.md
</commit_message>
<xml_diff>
--- a/Assessment report/avon_river_report_v2.docx
+++ b/Assessment report/avon_river_report_v2.docx
@@ -5,7 +5,45 @@
     <w:p>
       <w:pPr>
         <w:spacing w:before="80" w:after="80"/>
-      </w:pPr>
+        <w:jc w:val="center"/>
+      </w:pPr>
+      <w:r>
+        <w:drawing>
+          <wp:inline distT="0" distB="0" distL="0" distR="0" wp14:anchorId="15C69B7F" wp14:editId="7F481CD2">
+            <wp:extent cx="2924583" cy="1038370"/>
+            <wp:effectExtent l="0" t="0" r="9525" b="9525"/>
+            <wp:docPr id="1132778512" name="Picture 1"/>
+            <wp:cNvGraphicFramePr>
+              <a:graphicFrameLocks xmlns:a="http://schemas.openxmlformats.org/drawingml/2006/main" noChangeAspect="1"/>
+            </wp:cNvGraphicFramePr>
+            <a:graphic xmlns:a="http://schemas.openxmlformats.org/drawingml/2006/main">
+              <a:graphicData uri="http://schemas.openxmlformats.org/drawingml/2006/picture">
+                <pic:pic xmlns:pic="http://schemas.openxmlformats.org/drawingml/2006/picture">
+                  <pic:nvPicPr>
+                    <pic:cNvPr id="1132778512" name=""/>
+                    <pic:cNvPicPr/>
+                  </pic:nvPicPr>
+                  <pic:blipFill>
+                    <a:blip r:embed="rId6"/>
+                    <a:stretch>
+                      <a:fillRect/>
+                    </a:stretch>
+                  </pic:blipFill>
+                  <pic:spPr>
+                    <a:xfrm>
+                      <a:off x="0" y="0"/>
+                      <a:ext cx="2924583" cy="1038370"/>
+                    </a:xfrm>
+                    <a:prstGeom prst="rect">
+                      <a:avLst/>
+                    </a:prstGeom>
+                  </pic:spPr>
+                </pic:pic>
+              </a:graphicData>
+            </a:graphic>
+          </wp:inline>
+        </w:drawing>
+      </w:r>
     </w:p>
     <w:p>
       <w:pPr>
@@ -299,7 +337,7 @@
                 <w:sz w:val="20"/>
                 <w:szCs w:val="20"/>
               </w:rPr>
-              <w:t>Course</w:t>
+              <w:t>Programme</w:t>
             </w:r>
           </w:p>
         </w:tc>
@@ -327,7 +365,7 @@
                 <w:sz w:val="20"/>
                 <w:szCs w:val="20"/>
               </w:rPr>
-              <w:t>MSE803 Data Analytics</w:t>
+              <w:t>Master of Software Engineering</w:t>
             </w:r>
           </w:p>
         </w:tc>
@@ -351,6 +389,13 @@
             </w:tcMar>
           </w:tcPr>
           <w:p>
+            <w:pPr>
+              <w:rPr>
+                <w:color w:val="000000"/>
+                <w:sz w:val="20"/>
+                <w:szCs w:val="20"/>
+              </w:rPr>
+            </w:pPr>
             <w:r>
               <w:rPr>
                 <w:color w:val="000000"/>
@@ -379,6 +424,22 @@
             </w:tcMar>
           </w:tcPr>
           <w:p>
+            <w:r>
+              <w:rPr>
+                <w:color w:val="000000"/>
+                <w:sz w:val="20"/>
+                <w:szCs w:val="20"/>
+              </w:rPr>
+              <w:t>MSE803: Data Analytics</w:t>
+            </w:r>
+            <w:r>
+              <w:rPr>
+                <w:color w:val="000000"/>
+                <w:sz w:val="20"/>
+                <w:szCs w:val="20"/>
+              </w:rPr>
+              <w:t xml:space="preserve">- </w:t>
+            </w:r>
             <w:r>
               <w:rPr>
                 <w:color w:val="000000"/>
@@ -443,6 +504,14 @@
                 <w:sz w:val="20"/>
                 <w:szCs w:val="20"/>
               </w:rPr>
+              <w:t xml:space="preserve">Dr. </w:t>
+            </w:r>
+            <w:r>
+              <w:rPr>
+                <w:color w:val="000000"/>
+                <w:sz w:val="20"/>
+                <w:szCs w:val="20"/>
+              </w:rPr>
               <w:t>Mohammad Norouzifard</w:t>
             </w:r>
           </w:p>
@@ -495,6 +564,31 @@
             </w:tcMar>
           </w:tcPr>
           <w:p>
+            <w:r>
+              <w:rPr>
+                <w:color w:val="000000"/>
+                <w:sz w:val="20"/>
+                <w:szCs w:val="20"/>
+              </w:rPr>
+              <w:t>14</w:t>
+            </w:r>
+            <w:r>
+              <w:rPr>
+                <w:color w:val="000000"/>
+                <w:sz w:val="20"/>
+                <w:szCs w:val="20"/>
+                <w:vertAlign w:val="superscript"/>
+              </w:rPr>
+              <w:t>th</w:t>
+            </w:r>
+            <w:r>
+              <w:rPr>
+                <w:color w:val="000000"/>
+                <w:sz w:val="20"/>
+                <w:szCs w:val="20"/>
+              </w:rPr>
+              <w:t xml:space="preserve"> </w:t>
+            </w:r>
             <w:r>
               <w:rPr>
                 <w:color w:val="000000"/>
@@ -1351,7 +1445,15 @@
     </w:p>
     <w:p>
       <w:r>
-        <w:t>This assessment report has two main objectives. Task 1 will be analysing the Avon River data to identify environmental issues, providing the proper analytical tools, and making data based recommendations for managing the Avon River.Task 1 will involve analysing the Avon River data to identify environmental issues, provide the appropriate analytical tools and make data based recommendations for the management of the Avon River. The second (Task 2) requires students to analyse the data analytics strategies in two business scenarios: an AI based customer relationship management (CRM) system and a user experience (UX) improvement project with the use of A/B testing.</w:t>
+        <w:t xml:space="preserve">This assessment report has two main objectives. Task 1 will be analysing the Avon River data to identify environmental issues, providing the proper analytical tools, and making data based recommendations for managing the Avon </w:t>
+      </w:r>
+      <w:proofErr w:type="spellStart"/>
+      <w:r>
+        <w:t>River.Task</w:t>
+      </w:r>
+      <w:proofErr w:type="spellEnd"/>
+      <w:r>
+        <w:t xml:space="preserve"> 1 will involve analysing the Avon River data to identify environmental issues, provide the appropriate analytical tools and make data based recommendations for the management of the Avon River. The second (Task 2) requires students to analyse the data analytics strategies in two business scenarios: an AI based customer relationship management (CRM) system and a user experience (UX) improvement project with the use of A/B testing.</w:t>
       </w:r>
     </w:p>
     <w:p>
@@ -2119,12 +2221,22 @@
         <w:spacing w:before="80" w:after="80"/>
       </w:pPr>
       <w:r>
-        <w:t xml:space="preserve">The dissolved oxygen levels are affected by the temperature of the water (warmer water has less oxygen), break down of organic matter, the activity of algae, and movements of water. This dataset supports a </w:t>
-      </w:r>
+        <w:t xml:space="preserve">The dissolved oxygen levels are affected by the temperature of the water (warmer water has less oxygen), </w:t>
+      </w:r>
+      <w:proofErr w:type="spellStart"/>
+      <w:r>
+        <w:t>break down</w:t>
+      </w:r>
+      <w:proofErr w:type="spellEnd"/>
+      <w:r>
+        <w:t xml:space="preserve"> of organic matter, the activity of algae, and movements of water. This dataset supports a </w:t>
+      </w:r>
+      <w:proofErr w:type="spellStart"/>
       <w:proofErr w:type="gramStart"/>
       <w:r>
         <w:t>well known</w:t>
       </w:r>
+      <w:proofErr w:type="spellEnd"/>
       <w:proofErr w:type="gramEnd"/>
       <w:r>
         <w:t xml:space="preserve"> inverse relationship between temperature and dissolved oxygen solubility (Ficklin et al., 2013) as the pattern of higher temperatures and some lower DO levels were evident. This double blow might be particularly harmful in the long-term for fish stocks.</w:t>
@@ -2135,7 +2247,15 @@
         <w:spacing w:before="80" w:after="80"/>
       </w:pPr>
       <w:r>
-        <w:t xml:space="preserve">Fish data was extremely sparse: Some sites and times had only a few or very few Longfin Eel (Anguilla dieffenbachii) (a few as low as 3). There are several factors that affect eel population counts, but periods of low DO correlate with a decreased feeding activity and impaired immune system in eels (Chessman, 2013). Data analytics allows us to connect these blips in water quality to population fluctuations in the </w:t>
+        <w:t xml:space="preserve">Fish data was extremely sparse: Some sites and times had only a few or very few Longfin Eel (Anguilla </w:t>
+      </w:r>
+      <w:proofErr w:type="spellStart"/>
+      <w:r>
+        <w:t>dieffenbachii</w:t>
+      </w:r>
+      <w:proofErr w:type="spellEnd"/>
+      <w:r>
+        <w:t xml:space="preserve">) (a few as low as 3). There are several factors that affect eel population counts, but periods of low DO correlate with a decreased feeding activity and impaired immune system in eels (Chessman, 2013). Data analytics allows us to connect these blips in water quality to population fluctuations in the </w:t>
       </w:r>
       <w:proofErr w:type="gramStart"/>
       <w:r>
@@ -3018,7 +3138,15 @@
       </w:pPr>
       <w:r>
         <w:lastRenderedPageBreak/>
-        <w:t xml:space="preserve">The study period for the Avon River dataset is from early October through late December 2023, a total of about three months worth of data. A trend analysis of the data at each site can provide an indication of </w:t>
+        <w:t xml:space="preserve">The study period for the Avon River dataset is from early October through late December 2023, a total of about three </w:t>
+      </w:r>
+      <w:proofErr w:type="spellStart"/>
+      <w:r>
+        <w:t>months worth</w:t>
+      </w:r>
+      <w:proofErr w:type="spellEnd"/>
+      <w:r>
+        <w:t xml:space="preserve"> of data. A trend analysis of the data at each site can provide an indication of </w:t>
       </w:r>
       <w:proofErr w:type="gramStart"/>
       <w:r>
@@ -3204,7 +3332,15 @@
       </w:r>
       <w:proofErr w:type="gramEnd"/>
       <w:r>
-        <w:t xml:space="preserve"> has an intuitive interface that's accessible even to users who aren't a programmer. It has an embedded Data Analysis ToolPak that provides access to a variety of chart types, pivot tables, descriptive statistics and correlation tools. If the data set is small, such as the Avon River data (71 rows), Excel would be adequate for the computational needs. The Excel spreadsheets are also easily shared, so that results can be passed on to fellow employees or supervisors. Excel is still one of the top analysis tools used in government and environmental organisations because it is user friendly, according to Walkenbach (2015).</w:t>
+        <w:t xml:space="preserve"> has an intuitive interface that's accessible even to users who aren't a programmer. It has an embedded Data Analysis </w:t>
+      </w:r>
+      <w:proofErr w:type="spellStart"/>
+      <w:r>
+        <w:t>ToolPak</w:t>
+      </w:r>
+      <w:proofErr w:type="spellEnd"/>
+      <w:r>
+        <w:t xml:space="preserve"> that provides access to a variety of chart types, pivot tables, descriptive statistics and correlation tools. If the data set is small, such as the Avon River data (71 rows), Excel would be adequate for the computational needs. The Excel spreadsheets are also easily shared, so that results can be passed on to fellow employees or supervisors. Excel is still one of the top analysis tools used in government and environmental organisations because it is user friendly, according to Walkenbach (2015).</w:t>
       </w:r>
     </w:p>
     <w:p>
@@ -3241,7 +3377,15 @@
         <w:t xml:space="preserve">: </w:t>
       </w:r>
       <w:r>
-        <w:t>Excel is a great tool to start with as it's moderate size and the organisation may not have data scientists on board. It enables staff to undertake the fundamental analysis and create professional presentations without having to master coding. Importantly, Excel directly supports both of the analytical techniques selected in Section 2.2: the built-in Data Analysis ToolPak can be used to calculate the Pearson correlation between all the water quality and fish population variables, meeting Technique 1 (Correlation Analysis); and Excel's line chart function with overlay trendline is powerful enough to meet Technique 2 (Trend Analysis) — managers can easily visualize how dissolved oxygen and temperature changed throughout the study period (October–December) without writing another formula manually.</w:t>
+        <w:t xml:space="preserve">Excel is a great tool to start with as it's moderate size and the organisation may not have data scientists on board. It enables staff to undertake the fundamental analysis and create professional presentations without having to master coding. Importantly, Excel directly supports both of the analytical techniques selected in Section 2.2: the built-in Data Analysis </w:t>
+      </w:r>
+      <w:proofErr w:type="spellStart"/>
+      <w:r>
+        <w:t>ToolPak</w:t>
+      </w:r>
+      <w:proofErr w:type="spellEnd"/>
+      <w:r>
+        <w:t xml:space="preserve"> can be used to calculate the Pearson correlation between all the water quality and fish population variables, meeting Technique 1 (Correlation Analysis); and Excel's line chart function with overlay trendline is powerful enough to meet Technique 2 (Trend Analysis) — managers can easily visualize how dissolved oxygen and temperature changed throughout the study period (October–December) without writing another formula manually.</w:t>
       </w:r>
     </w:p>
     <w:p>
@@ -3328,7 +3472,15 @@
         <w:t xml:space="preserve">Limitations: </w:t>
       </w:r>
       <w:r>
-        <w:t>Python takes time to learn compared with Excel, particularly to people who have never programmed before. Some technical knowledge is required to set up the development environment (installation of python, jupyter notebook and necessary libraries). In case of one-off analyses, you might need more time to learn Python than to just open Excel.</w:t>
+        <w:t xml:space="preserve">Python takes time to learn compared with Excel, particularly to people who have never programmed before. Some technical knowledge is required to set up the development environment (installation of python, </w:t>
+      </w:r>
+      <w:proofErr w:type="spellStart"/>
+      <w:r>
+        <w:t>jupyter</w:t>
+      </w:r>
+      <w:proofErr w:type="spellEnd"/>
+      <w:r>
+        <w:t xml:space="preserve"> notebook and necessary libraries). In case of one-off analyses, you might need more time to learn Python than to just open Excel.</w:t>
       </w:r>
     </w:p>
     <w:p>
@@ -3338,10 +3490,12 @@
       <w:r>
         <w:t xml:space="preserve">Python is the more appropriate language for creating the reproducible and automated analysis outlined in this report, particularly for this dataset, which will probably be updated frequently with new readings. It also facilitates very easy implementation of more advanced techniques like correlation matrices, trend line fitting, and multi-site comparison charts, after the initial coding. Python's </w:t>
       </w:r>
+      <w:proofErr w:type="spellStart"/>
       <w:proofErr w:type="gramStart"/>
       <w:r>
         <w:t>scipy.stats</w:t>
       </w:r>
+      <w:proofErr w:type="spellEnd"/>
       <w:proofErr w:type="gramEnd"/>
       <w:r>
         <w:t xml:space="preserve"> library includes a single function that calculates the whole Pearson correlation matrix for technique 1: all pairwise</w:t>
@@ -4072,7 +4226,7 @@
                     <pic:cNvPicPr/>
                   </pic:nvPicPr>
                   <pic:blipFill>
-                    <a:blip r:embed="rId6">
+                    <a:blip r:embed="rId7">
                       <a:extLst>
                         <a:ext uri="{28A0092B-C50C-407E-A947-70E740481C1C}">
                           <a14:useLocalDpi xmlns:a14="http://schemas.microsoft.com/office/drawing/2010/main" val="0"/>
@@ -4158,7 +4312,7 @@
                     <pic:cNvPicPr/>
                   </pic:nvPicPr>
                   <pic:blipFill>
-                    <a:blip r:embed="rId7">
+                    <a:blip r:embed="rId8">
                       <a:extLst>
                         <a:ext uri="{28A0092B-C50C-407E-A947-70E740481C1C}">
                           <a14:useLocalDpi xmlns:a14="http://schemas.microsoft.com/office/drawing/2010/main" val="0"/>
@@ -4238,7 +4392,7 @@
                     <pic:cNvPicPr/>
                   </pic:nvPicPr>
                   <pic:blipFill>
-                    <a:blip r:embed="rId8">
+                    <a:blip r:embed="rId9">
                       <a:extLst>
                         <a:ext uri="{28A0092B-C50C-407E-A947-70E740481C1C}">
                           <a14:useLocalDpi xmlns:a14="http://schemas.microsoft.com/office/drawing/2010/main" val="0"/>
@@ -4314,7 +4468,7 @@
                     <pic:cNvPicPr/>
                   </pic:nvPicPr>
                   <pic:blipFill>
-                    <a:blip r:embed="rId9">
+                    <a:blip r:embed="rId10">
                       <a:extLst>
                         <a:ext uri="{28A0092B-C50C-407E-A947-70E740481C1C}">
                           <a14:useLocalDpi xmlns:a14="http://schemas.microsoft.com/office/drawing/2010/main" val="0"/>
@@ -4450,8 +4604,13 @@
       </w:r>
       <w:proofErr w:type="gramEnd"/>
       <w:r>
-        <w:t xml:space="preserve"> increased dissolved oxygen concentrations (which is beneficial because cooler water contains more oxygen) and habitat improvement for cold water dependent species like Brown Trout and Longfin Eel. Additionally, shading over time will inhibit the growth of algae and stabilize the pH.</w:t>
-      </w:r>
+        <w:t xml:space="preserve"> increased dissolved oxygen concentrations (which is beneficial because cooler water contains more oxygen) and habitat improvement for cold water dependent species like Brown Trout and Longfin Eel. Additionally, shading over time will inhibit the growth of algae and stabilize the </w:t>
+      </w:r>
+      <w:proofErr w:type="spellStart"/>
+      <w:r>
+        <w:t>pH.</w:t>
+      </w:r>
+      <w:proofErr w:type="spellEnd"/>
     </w:p>
     <w:p>
       <w:pPr>
@@ -4675,7 +4834,23 @@
         <w:t xml:space="preserve"> </w:t>
       </w:r>
       <w:r>
-        <w:t xml:space="preserve">One of the most common advantages of data-driven approaches is that they decrease the need for individual intuition and bias in decision making (McAfee and Brynjolfsson, 2012). An AI-powered CRM can analyze thousands of records of customer interactions in Project A and reveal trends in customer purchase behavior that a human sales manager might have missed. It could also show that customers who call support within 30 days of buying are three times more likely to churn, helping to identify strategies to prevent them from doing so. A/B testing, in Project B, is used in place of anecdotal arguments about design choices for creating the empirical evidence. Rather than </w:t>
+        <w:t xml:space="preserve">One of the most common advantages of data-driven approaches is that they decrease the need for individual intuition and bias in decision making (McAfee and Brynjolfsson, 2012). An AI-powered CRM can </w:t>
+      </w:r>
+      <w:proofErr w:type="spellStart"/>
+      <w:r>
+        <w:t>analyze</w:t>
+      </w:r>
+      <w:proofErr w:type="spellEnd"/>
+      <w:r>
+        <w:t xml:space="preserve"> thousands of records of customer interactions in Project A and reveal trends in customer purchase </w:t>
+      </w:r>
+      <w:proofErr w:type="spellStart"/>
+      <w:r>
+        <w:t>behavior</w:t>
+      </w:r>
+      <w:proofErr w:type="spellEnd"/>
+      <w:r>
+        <w:t xml:space="preserve"> that a human sales manager might have missed. It could also show that customers who call support within 30 days of buying are three times more likely to churn, helping to identify strategies to prevent them from doing so. A/B testing, in Project B, is used in place of anecdotal arguments about design choices for creating the empirical evidence. Rather than </w:t>
       </w:r>
       <w:proofErr w:type="gramStart"/>
       <w:r>
@@ -4798,7 +4973,15 @@
         <w:t>Model uncertainty</w:t>
       </w:r>
       <w:r>
-        <w:t xml:space="preserve"> – Machine learning models can be very good on the historical training data, but do not perform well on new data examples – this is called overfitting. A CRM model that is trained based on customer behavior before the pandemic could give wrong predictions in a post-pandemic environment. With multiple variations tested at once in Project B, the statistical significance threshold of an A/B test can be </w:t>
+        <w:t xml:space="preserve"> – Machine learning models can be very good on the historical training data, but do not perform well on new data examples – this is called overfitting. A CRM model that is trained based on customer </w:t>
+      </w:r>
+      <w:proofErr w:type="spellStart"/>
+      <w:r>
+        <w:t>behavior</w:t>
+      </w:r>
+      <w:proofErr w:type="spellEnd"/>
+      <w:r>
+        <w:t xml:space="preserve"> before the pandemic could give wrong predictions in a post-pandemic environment. With multiple variations tested at once in Project B, the statistical significance threshold of an A/B test can be </w:t>
       </w:r>
       <w:proofErr w:type="gramStart"/>
       <w:r>
@@ -4806,7 +4989,15 @@
       </w:r>
       <w:proofErr w:type="gramEnd"/>
       <w:r>
-        <w:t xml:space="preserve"> give false positive results without appropriate correction (Kohavi et al., 2020).</w:t>
+        <w:t xml:space="preserve"> give false positive results without appropriate correction (</w:t>
+      </w:r>
+      <w:proofErr w:type="spellStart"/>
+      <w:r>
+        <w:t>Kohavi</w:t>
+      </w:r>
+      <w:proofErr w:type="spellEnd"/>
+      <w:r>
+        <w:t xml:space="preserve"> et al., 2020).</w:t>
       </w:r>
     </w:p>
     <w:p>
@@ -4824,7 +5015,15 @@
         <w:t>Privacy issues:</w:t>
       </w:r>
       <w:r>
-        <w:t xml:space="preserve"> Both projects require a lot of personal information to be gathered and analyzed. Customer profiles and purchase histories are sensitive personal information that must be handled appropriately in line with relevant privacy laws, including the Privacy Act 2020 in New Zealand and the EU General Data Protection Regulation (GDPR). For Project B, informed consent and clear communication of the use of clickstream information and feedback forms is required to track individual user actions. Responsible privacy management can lead to regulatory fines and reputation damage.</w:t>
+        <w:t xml:space="preserve"> Both projects require a lot of personal information to be gathered and </w:t>
+      </w:r>
+      <w:proofErr w:type="spellStart"/>
+      <w:r>
+        <w:t>analyzed</w:t>
+      </w:r>
+      <w:proofErr w:type="spellEnd"/>
+      <w:r>
+        <w:t>. Customer profiles and purchase histories are sensitive personal information that must be handled appropriately in line with relevant privacy laws, including the Privacy Act 2020 in New Zealand and the EU General Data Protection Regulation (GDPR). For Project B, informed consent and clear communication of the use of clickstream information and feedback forms is required to track individual user actions. Responsible privacy management can lead to regulatory fines and reputation damage.</w:t>
       </w:r>
     </w:p>
     <w:p>
@@ -5716,7 +5915,29 @@
           <w:sz w:val="22"/>
           <w:szCs w:val="22"/>
         </w:rPr>
-        <w:t>The first risk is Algorithmic Bias and Unfair Targeting.The first risk is Algorithmic Bias and Unfair Targeting.</w:t>
+        <w:t xml:space="preserve">The first risk is Algorithmic Bias and Unfair </w:t>
+      </w:r>
+      <w:proofErr w:type="spellStart"/>
+      <w:r>
+        <w:rPr>
+          <w:b w:val="0"/>
+          <w:bCs w:val="0"/>
+          <w:color w:val="auto"/>
+          <w:sz w:val="22"/>
+          <w:szCs w:val="22"/>
+        </w:rPr>
+        <w:t>Targeting.The</w:t>
+      </w:r>
+      <w:proofErr w:type="spellEnd"/>
+      <w:r>
+        <w:rPr>
+          <w:b w:val="0"/>
+          <w:bCs w:val="0"/>
+          <w:color w:val="auto"/>
+          <w:sz w:val="22"/>
+          <w:szCs w:val="22"/>
+        </w:rPr>
+        <w:t xml:space="preserve"> first risk is Algorithmic Bias and Unfair Targeting.</w:t>
       </w:r>
       <w:r>
         <w:rPr>
@@ -6094,7 +6315,29 @@
           <w:sz w:val="22"/>
           <w:szCs w:val="22"/>
         </w:rPr>
-        <w:t xml:space="preserve"> result in negative reviews or churn over time. Kohavi et al. (2020) warn against using readily available variables as a substitute: "If you measure it, you manage it – sometimes at the cost of managing what matters.</w:t>
+        <w:t xml:space="preserve"> result in negative reviews or churn over time. </w:t>
+      </w:r>
+      <w:proofErr w:type="spellStart"/>
+      <w:r>
+        <w:rPr>
+          <w:b w:val="0"/>
+          <w:bCs w:val="0"/>
+          <w:color w:val="auto"/>
+          <w:sz w:val="22"/>
+          <w:szCs w:val="22"/>
+        </w:rPr>
+        <w:t>Kohavi</w:t>
+      </w:r>
+      <w:proofErr w:type="spellEnd"/>
+      <w:r>
+        <w:rPr>
+          <w:b w:val="0"/>
+          <w:bCs w:val="0"/>
+          <w:color w:val="auto"/>
+          <w:sz w:val="22"/>
+          <w:szCs w:val="22"/>
+        </w:rPr>
+        <w:t xml:space="preserve"> et al. (2020) warn against using readily available variables as a substitute: "If you measure it, you manage it – sometimes at the cost of managing what matters.</w:t>
       </w:r>
     </w:p>
     <w:p>
@@ -6253,7 +6496,29 @@
           <w:szCs w:val="22"/>
         </w:rPr>
         <w:br/>
-        <w:t xml:space="preserve">While A/B testing produces statistically sound quantitative information, it doesn't provide an explanation of user behavior. A design variation may win a statistically significant advantage in an A/B </w:t>
+        <w:t xml:space="preserve">While A/B testing produces statistically sound quantitative information, it doesn't provide an explanation of user </w:t>
+      </w:r>
+      <w:proofErr w:type="spellStart"/>
+      <w:r>
+        <w:rPr>
+          <w:b w:val="0"/>
+          <w:bCs w:val="0"/>
+          <w:color w:val="auto"/>
+          <w:sz w:val="22"/>
+          <w:szCs w:val="22"/>
+        </w:rPr>
+        <w:t>behavior</w:t>
+      </w:r>
+      <w:proofErr w:type="spellEnd"/>
+      <w:r>
+        <w:rPr>
+          <w:b w:val="0"/>
+          <w:bCs w:val="0"/>
+          <w:color w:val="auto"/>
+          <w:sz w:val="22"/>
+          <w:szCs w:val="22"/>
+        </w:rPr>
+        <w:t xml:space="preserve">. A design variation may win a statistically significant advantage in an A/B </w:t>
       </w:r>
       <w:proofErr w:type="gramStart"/>
       <w:r>
@@ -6491,7 +6756,29 @@
           <w:sz w:val="22"/>
           <w:szCs w:val="22"/>
         </w:rPr>
-        <w:t xml:space="preserve"> returns, such as an uptick in conversion and retention that would come from an improvement in the user experience with relatively low investment. As Kohavi et al. (2020) point out, companies with seasoned A/B testing initiatives are frequently superior to rivals when it comes to user-friendliness of their products.</w:t>
+        <w:t xml:space="preserve"> returns, such as an uptick in conversion and retention that would come from an improvement in the user experience with relatively low investment. As </w:t>
+      </w:r>
+      <w:proofErr w:type="spellStart"/>
+      <w:r>
+        <w:rPr>
+          <w:b w:val="0"/>
+          <w:bCs w:val="0"/>
+          <w:color w:val="auto"/>
+          <w:sz w:val="22"/>
+          <w:szCs w:val="22"/>
+        </w:rPr>
+        <w:t>Kohavi</w:t>
+      </w:r>
+      <w:proofErr w:type="spellEnd"/>
+      <w:r>
+        <w:rPr>
+          <w:b w:val="0"/>
+          <w:bCs w:val="0"/>
+          <w:color w:val="auto"/>
+          <w:sz w:val="22"/>
+          <w:szCs w:val="22"/>
+        </w:rPr>
+        <w:t xml:space="preserve"> et al. (2020) point out, companies with seasoned A/B testing initiatives are frequently superior to rivals when it comes to user-friendliness of their products.</w:t>
       </w:r>
     </w:p>
     <w:p>
@@ -6694,7 +6981,51 @@
           <w:sz w:val="22"/>
           <w:szCs w:val="22"/>
         </w:rPr>
-        <w:t>: This dimension shows that there is an important discrepancy between the two projects. Project B is fortunate in that there is ample data available: web analytics platforms (Google Analytics, Mixpanel, etc.) and basic usability metrics (clickstream, etc.) should already be available, and thus clickstream data and simple usability attributes should be immediately available to help shape the design of A/B tests. There is no need to create a new data infrastructure. Surveys of user satisfaction can be rolled out in just a few days. Project A, on the other hand, has a less ideal data availability scenario. A successful AI-CRM solution needs years of clean, consistently labeled customer interaction history, data on customer purchases, and ideally churn data — which can be stored in legacy systems but are probably unorganized, misaligned or incomplete. A huge amount of effort is needed in collecting, integrating and cleaning data before any model will be able to be trained. One of the most compelling reasons for sequencing Project B first is the availability of the data; there's no data foundation for Project A, while for Project B the data is ready to go (Davenport &amp; Harris, 2007).</w:t>
+        <w:t xml:space="preserve">: This dimension shows that there is an important discrepancy between the two projects. Project B is fortunate in that there is ample data available: web analytics platforms (Google Analytics, </w:t>
+      </w:r>
+      <w:proofErr w:type="spellStart"/>
+      <w:r>
+        <w:rPr>
+          <w:b w:val="0"/>
+          <w:bCs w:val="0"/>
+          <w:color w:val="auto"/>
+          <w:sz w:val="22"/>
+          <w:szCs w:val="22"/>
+        </w:rPr>
+        <w:t>Mixpanel</w:t>
+      </w:r>
+      <w:proofErr w:type="spellEnd"/>
+      <w:r>
+        <w:rPr>
+          <w:b w:val="0"/>
+          <w:bCs w:val="0"/>
+          <w:color w:val="auto"/>
+          <w:sz w:val="22"/>
+          <w:szCs w:val="22"/>
+        </w:rPr>
+        <w:t xml:space="preserve">, etc.) and basic usability metrics (clickstream, etc.) should already be available, and thus clickstream data and simple usability attributes should be immediately available to help shape the design of A/B tests. There is no need to create a new data infrastructure. Surveys of user satisfaction can be rolled out in just a few days. Project A, on the other hand, has a less ideal data availability scenario. A successful AI-CRM solution needs years of clean, consistently </w:t>
+      </w:r>
+      <w:proofErr w:type="spellStart"/>
+      <w:r>
+        <w:rPr>
+          <w:b w:val="0"/>
+          <w:bCs w:val="0"/>
+          <w:color w:val="auto"/>
+          <w:sz w:val="22"/>
+          <w:szCs w:val="22"/>
+        </w:rPr>
+        <w:t>labeled</w:t>
+      </w:r>
+      <w:proofErr w:type="spellEnd"/>
+      <w:r>
+        <w:rPr>
+          <w:b w:val="0"/>
+          <w:bCs w:val="0"/>
+          <w:color w:val="auto"/>
+          <w:sz w:val="22"/>
+          <w:szCs w:val="22"/>
+        </w:rPr>
+        <w:t xml:space="preserve"> customer interaction history, data on customer purchases, and ideally churn data — which can be stored in legacy systems but are probably unorganized, misaligned or incomplete. A huge amount of effort is needed in collecting, integrating and cleaning data before any model will be able to be trained. One of the most compelling reasons for sequencing Project B first is the availability of the data; there's no data foundation for Project A, while for Project B the data is ready to go (Davenport &amp; Harris, 2007).</w:t>
       </w:r>
       <w:r>
         <w:rPr>
@@ -6949,9 +7280,46 @@
     <w:p>
       <w:pPr>
         <w:pStyle w:val="Heading1"/>
+        <w:rPr>
+          <w:b w:val="0"/>
+          <w:bCs w:val="0"/>
+          <w:color w:val="auto"/>
+          <w:sz w:val="22"/>
+          <w:szCs w:val="22"/>
+        </w:rPr>
+      </w:pPr>
+    </w:p>
+    <w:p>
+      <w:pPr>
+        <w:pStyle w:val="Heading1"/>
+        <w:rPr>
+          <w:b w:val="0"/>
+          <w:bCs w:val="0"/>
+          <w:color w:val="auto"/>
+          <w:sz w:val="22"/>
+          <w:szCs w:val="22"/>
+        </w:rPr>
+      </w:pPr>
+    </w:p>
+    <w:p>
+      <w:pPr>
+        <w:pStyle w:val="Heading1"/>
+        <w:rPr>
+          <w:b w:val="0"/>
+          <w:bCs w:val="0"/>
+          <w:color w:val="auto"/>
+          <w:sz w:val="22"/>
+          <w:szCs w:val="22"/>
+        </w:rPr>
+      </w:pPr>
+    </w:p>
+    <w:p>
+      <w:pPr>
+        <w:pStyle w:val="Heading1"/>
       </w:pPr>
       <w:bookmarkStart w:id="14" w:name="_Toc232361073"/>
       <w:r>
+        <w:lastRenderedPageBreak/>
         <w:t>5. References</w:t>
       </w:r>
       <w:bookmarkEnd w:id="14"/>
@@ -6976,7 +7344,6 @@
         <w:jc w:val="both"/>
       </w:pPr>
       <w:r>
-        <w:lastRenderedPageBreak/>
         <w:t>Chessman, B. C. (2013). Identifying species-specific trends in freshwater fish biodiversity: Implications for ecological indicators and conservation management. Aquatic Conservation: Marine and Freshwater Ecosystems, 23(4), 490-502. https://doi.org/10.1002/aqc.2348</w:t>
       </w:r>
     </w:p>
@@ -7005,7 +7372,15 @@
         <w:jc w:val="both"/>
       </w:pPr>
       <w:r>
-        <w:t>Elliott, J. M., &amp; Elliott, J. A. (2010). Temperature requirements of Atlantic salmon Salmo salar, brown trout Salmo trutta and Arctic charr Salvelinus alpinus: Predicting the effects of climate change. Journal of Fish Biology, 77(8), 1793-1817. https://doi.org/10.1111/j.1095-8649.2010.02762.x</w:t>
+        <w:t xml:space="preserve">Elliott, J. M., &amp; Elliott, J. A. (2010). Temperature requirements of Atlantic salmon Salmo </w:t>
+      </w:r>
+      <w:proofErr w:type="spellStart"/>
+      <w:r>
+        <w:t>salar</w:t>
+      </w:r>
+      <w:proofErr w:type="spellEnd"/>
+      <w:r>
+        <w:t>, brown trout Salmo trutta and Arctic charr Salvelinus alpinus: Predicting the effects of climate change. Journal of Fish Biology, 77(8), 1793-1817. https://doi.org/10.1111/j.1095-8649.2010.02762.x</w:t>
       </w:r>
     </w:p>
     <w:p>
@@ -7019,7 +7394,15 @@
         <w:jc w:val="both"/>
       </w:pPr>
       <w:r>
-        <w:t>Ficklin, D. L., Luo, Y., Stewart, I. T., &amp; Maurer, E. P. (2013). Development and application of a hydroclimatological stream temperature model within the Soil and Water Assessment Tool. Water Resources Research, 48(1), W01511. https://doi.org/10.1029/2011WR011256</w:t>
+        <w:t xml:space="preserve">Ficklin, D. L., Luo, Y., Stewart, I. T., &amp; Maurer, E. P. (2013). Development and application of a </w:t>
+      </w:r>
+      <w:proofErr w:type="spellStart"/>
+      <w:r>
+        <w:t>hydroclimatological</w:t>
+      </w:r>
+      <w:proofErr w:type="spellEnd"/>
+      <w:r>
+        <w:t xml:space="preserve"> stream temperature model within the Soil and Water Assessment Tool. Water Resources Research, 48(1), W01511. https://doi.org/10.1029/2011WR011256</w:t>
       </w:r>
     </w:p>
     <w:p>
@@ -7033,7 +7416,15 @@
         <w:jc w:val="both"/>
       </w:pPr>
       <w:r>
-        <w:t>Harrell, F. E. (2015). Regression modeling strategies: With applications to linear models, logistic and ordinal regression, and survival analysis (2nd ed.). Springer.</w:t>
+        <w:t xml:space="preserve">Harrell, F. E. (2015). Regression </w:t>
+      </w:r>
+      <w:proofErr w:type="spellStart"/>
+      <w:r>
+        <w:t>modeling</w:t>
+      </w:r>
+      <w:proofErr w:type="spellEnd"/>
+      <w:r>
+        <w:t xml:space="preserve"> strategies: With applications to linear models, logistic and ordinal regression, and survival analysis (2nd ed.). Springer.</w:t>
       </w:r>
     </w:p>
     <w:p>
@@ -7060,8 +7451,13 @@
         <w:spacing w:before="80" w:after="100"/>
         <w:jc w:val="both"/>
       </w:pPr>
-      <w:r>
-        <w:t>Kohavi, R., Tang, D., &amp; Xu, Y. (2020). Trustworthy online controlled experiments: A practical guide to A/B testing. Cambridge University Press.</w:t>
+      <w:proofErr w:type="spellStart"/>
+      <w:r>
+        <w:t>Kohavi</w:t>
+      </w:r>
+      <w:proofErr w:type="spellEnd"/>
+      <w:r>
+        <w:t>, R., Tang, D., &amp; Xu, Y. (2020). Trustworthy online controlled experiments: A practical guide to A/B testing. Cambridge University Press.</w:t>
       </w:r>
     </w:p>
     <w:p>
@@ -7117,7 +7513,23 @@
         <w:jc w:val="both"/>
       </w:pPr>
       <w:r>
-        <w:t>Mittelstadt, B. D., Allo, P., Taddeo, M., Wachter, S., &amp; Floridi, L. (2016). The ethics of algorithms: Mapping the debate. Big Data &amp; Society, 3(2), 2053951716679679. https://doi.org/10.1177/2053951716679679</w:t>
+        <w:t xml:space="preserve">Mittelstadt, B. D., </w:t>
+      </w:r>
+      <w:proofErr w:type="spellStart"/>
+      <w:r>
+        <w:t>Allo</w:t>
+      </w:r>
+      <w:proofErr w:type="spellEnd"/>
+      <w:r>
+        <w:t xml:space="preserve">, P., Taddeo, M., Wachter, S., &amp; </w:t>
+      </w:r>
+      <w:proofErr w:type="spellStart"/>
+      <w:r>
+        <w:t>Floridi</w:t>
+      </w:r>
+      <w:proofErr w:type="spellEnd"/>
+      <w:r>
+        <w:t>, L. (2016). The ethics of algorithms: Mapping the debate. Big Data &amp; Society, 3(2), 2053951716679679. https://doi.org/10.1177/2053951716679679</w:t>
       </w:r>
     </w:p>
     <w:p>
@@ -7131,7 +7543,6 @@
         <w:jc w:val="both"/>
       </w:pPr>
       <w:r>
-        <w:lastRenderedPageBreak/>
         <w:t>Nielsen, J. (2012). Usability 101: Introduction to usability. Nielsen Norman Group. https://www.nngroup.com/articles/usability-101-introduction-to-usability/</w:t>
       </w:r>
     </w:p>

</xml_diff>